<commit_message>
Karty pracy: daty podpisów na pierwszy dzień roboczy kolejnego miesiąca
Co-Authored-By: Claude Sonnet 5.5 <noreply@anthropic.com>
Claude-Session: https://claude.ai/code/session_01Tjc2hnwuZeEHHZpW9z6Grg
</commit_message>
<xml_diff>
--- a/karty_pracy_zadanie3/11._Anna_Di_Giusto_Karta_czasu_pracy_01.2027.docx
+++ b/karty_pracy_zadanie3/11._Anna_Di_Giusto_Karta_czasu_pracy_01.2027.docx
@@ -717,19 +717,19 @@
           <w:rFonts w:ascii="Calibri" w:cs="Calibri" w:eastAsia="Calibri" w:hAnsi="Calibri"/>
           <w:rtl w:val="0"/>
         </w:rPr>
-        <w:t xml:space="preserve">02.02.2027</w:t>
-        <w:tab/>
-        <w:tab/>
-        <w:tab/>
-        <w:tab/>
-        <w:tab/>
-        <w:tab/>
-        <w:tab/>
-        <w:tab/>
-        <w:tab/>
-        <w:tab/>
-        <w:tab/>
-        <w:t xml:space="preserve">02.02.2027</w:t>
+        <w:t xml:space="preserve">01.02.2027</w:t>
+        <w:tab/>
+        <w:tab/>
+        <w:tab/>
+        <w:tab/>
+        <w:tab/>
+        <w:tab/>
+        <w:tab/>
+        <w:tab/>
+        <w:tab/>
+        <w:tab/>
+        <w:tab/>
+        <w:t xml:space="preserve">01.02.2027</w:t>
       </w:r>
     </w:p>
     <w:p>

</xml_diff>